<commit_message>
fix(ui,reports): clarify facilities and prediction feedback
</commit_message>
<xml_diff>
--- a/report/冶金设施工程预测方法的建模及计算仿真报告202608.docx
+++ b/report/冶金设施工程预测方法的建模及计算仿真报告202608.docx
@@ -3079,18 +3079,8 @@
             <w:shd w:val="clear" w:color="auto" w:fill="FFFFFF"/>
           </w:tcPr>
           <w:p>
-            <w:pPr>
-              <w:pStyle w:val="54"/>
-              <w:bidi w:val="0"/>
-              <w:rPr>
-                <w:b w:val="0"/>
-              </w:rPr>
-            </w:pPr>
-            <w:r>
-              <w:rPr>
-                <w:b w:val="0"/>
-              </w:rPr>
-              <w:t>228</w:t>
+            <w:r>
+              <w:t>276</w:t>
             </w:r>
           </w:p>
         </w:tc>
@@ -3222,18 +3212,8 @@
             <w:shd w:val="clear" w:color="auto" w:fill="FFFFFF"/>
           </w:tcPr>
           <w:p>
-            <w:pPr>
-              <w:pStyle w:val="54"/>
-              <w:bidi w:val="0"/>
-              <w:rPr>
-                <w:b w:val="0"/>
-              </w:rPr>
-            </w:pPr>
-            <w:r>
-              <w:rPr>
-                <w:b w:val="0"/>
-              </w:rPr>
-              <w:t>108</w:t>
+            <w:r>
+              <w:t>204</w:t>
             </w:r>
           </w:p>
         </w:tc>
@@ -3365,17 +3345,7 @@
             <w:shd w:val="clear" w:color="auto" w:fill="FFFFFF"/>
           </w:tcPr>
           <w:p>
-            <w:pPr>
-              <w:pStyle w:val="54"/>
-              <w:bidi w:val="0"/>
-              <w:rPr>
-                <w:b w:val="0"/>
-              </w:rPr>
-            </w:pPr>
-            <w:r>
-              <w:rPr>
-                <w:b w:val="0"/>
-              </w:rPr>
+            <w:r>
               <w:t>108</w:t>
             </w:r>
           </w:p>
@@ -4338,7 +4308,7 @@
           </w:tcPr>
           <w:p>
             <w:r>
-              <w:t>实测平均 0.188 s，含模型加载</w:t>
+              <w:t>首次加载约数秒；本地热缓存平均约0.72 s，含依赖导入、模型加载、特征计算和推理</w:t>
             </w:r>
           </w:p>
         </w:tc>
@@ -13770,15 +13740,8 @@
             <w:vAlign w:val="top"/>
           </w:tcPr>
           <w:p>
-            <w:pPr>
-              <w:pStyle w:val="54"/>
-              <w:bidi w:val="0"/>
-              <w:rPr>
-                <w:rFonts w:hint="default"/>
-              </w:rPr>
-            </w:pPr>
-            <w:r>
-              <w:t>95.7657%</w:t>
+            <w:r>
+              <w:t>95.6389%</w:t>
             </w:r>
           </w:p>
         </w:tc>
@@ -13795,15 +13758,8 @@
             <w:vAlign w:val="top"/>
           </w:tcPr>
           <w:p>
-            <w:pPr>
-              <w:pStyle w:val="54"/>
-              <w:bidi w:val="0"/>
-              <w:rPr>
-                <w:rFonts w:hint="default"/>
-              </w:rPr>
-            </w:pPr>
-            <w:r>
-              <w:t>—</w:t>
+            <w:r>
+              <w:t>96.7547%</w:t>
             </w:r>
           </w:p>
         </w:tc>
@@ -13863,15 +13819,8 @@
             <w:vAlign w:val="top"/>
           </w:tcPr>
           <w:p>
-            <w:pPr>
-              <w:pStyle w:val="54"/>
-              <w:bidi w:val="0"/>
-              <w:rPr>
-                <w:rFonts w:hint="default"/>
-              </w:rPr>
-            </w:pPr>
-            <w:r>
-              <w:t>95.6561%</w:t>
+            <w:r>
+              <w:t>95.9591%</w:t>
             </w:r>
           </w:p>
         </w:tc>
@@ -13888,15 +13837,8 @@
             <w:vAlign w:val="top"/>
           </w:tcPr>
           <w:p>
-            <w:pPr>
-              <w:pStyle w:val="54"/>
-              <w:bidi w:val="0"/>
-              <w:rPr>
-                <w:rFonts w:hint="default"/>
-              </w:rPr>
-            </w:pPr>
-            <w:r>
-              <w:t>95.2555%</w:t>
+            <w:r>
+              <w:t>97.2075%</w:t>
             </w:r>
           </w:p>
         </w:tc>
@@ -14035,15 +13977,8 @@
             <w:vAlign w:val="top"/>
           </w:tcPr>
           <w:p>
-            <w:pPr>
-              <w:pStyle w:val="54"/>
-              <w:bidi w:val="0"/>
-              <w:rPr>
-                <w:rFonts w:hint="default"/>
-              </w:rPr>
-            </w:pPr>
-            <w:r>
-              <w:t>95.7657%</w:t>
+            <w:r>
+              <w:t>95.9134%</w:t>
             </w:r>
           </w:p>
         </w:tc>
@@ -14060,15 +13995,8 @@
             <w:vAlign w:val="top"/>
           </w:tcPr>
           <w:p>
-            <w:pPr>
-              <w:pStyle w:val="54"/>
-              <w:bidi w:val="0"/>
-              <w:rPr>
-                <w:rFonts w:hint="default"/>
-              </w:rPr>
-            </w:pPr>
-            <w:r>
-              <w:t>95.5292%</w:t>
+            <w:r>
+              <w:t>97.1321%</w:t>
             </w:r>
           </w:p>
         </w:tc>
@@ -14128,15 +14056,8 @@
             <w:vAlign w:val="top"/>
           </w:tcPr>
           <w:p>
-            <w:pPr>
-              <w:pStyle w:val="54"/>
-              <w:bidi w:val="0"/>
-              <w:rPr>
-                <w:rFonts w:hint="default"/>
-              </w:rPr>
-            </w:pPr>
-            <w:r>
-              <w:t>95.8204%</w:t>
+            <w:r>
+              <w:t>95.9591%</w:t>
             </w:r>
           </w:p>
         </w:tc>
@@ -14153,15 +14074,8 @@
             <w:vAlign w:val="top"/>
           </w:tcPr>
           <w:p>
-            <w:pPr>
-              <w:pStyle w:val="54"/>
-              <w:bidi w:val="0"/>
-              <w:rPr>
-                <w:rFonts w:hint="default"/>
-              </w:rPr>
-            </w:pPr>
-            <w:r>
-              <w:t>95.5292%</w:t>
+            <w:r>
+              <w:t>97.1321%</w:t>
             </w:r>
           </w:p>
         </w:tc>
@@ -14221,15 +14135,8 @@
             <w:vAlign w:val="top"/>
           </w:tcPr>
           <w:p>
-            <w:pPr>
-              <w:pStyle w:val="54"/>
-              <w:bidi w:val="0"/>
-              <w:rPr>
-                <w:rFonts w:hint="default"/>
-              </w:rPr>
-            </w:pPr>
-            <w:r>
-              <w:t>95.7839%</w:t>
+            <w:r>
+              <w:t>95.8981%</w:t>
             </w:r>
           </w:p>
         </w:tc>
@@ -14246,15 +14153,8 @@
             <w:vAlign w:val="top"/>
           </w:tcPr>
           <w:p>
-            <w:pPr>
-              <w:pStyle w:val="54"/>
-              <w:bidi w:val="0"/>
-              <w:rPr>
-                <w:rFonts w:hint="default"/>
-              </w:rPr>
-            </w:pPr>
-            <w:r>
-              <w:t>95.1642%</w:t>
+            <w:r>
+              <w:t>97.2075%</w:t>
             </w:r>
           </w:p>
         </w:tc>
@@ -14308,15 +14208,8 @@
             <w:vAlign w:val="top"/>
           </w:tcPr>
           <w:p>
-            <w:pPr>
-              <w:pStyle w:val="54"/>
-              <w:bidi w:val="0"/>
-              <w:rPr>
-                <w:rFonts w:hint="default"/>
-              </w:rPr>
-            </w:pPr>
-            <w:r>
-              <w:t>95.8204%</w:t>
+            <w:r>
+              <w:t>95.9134%</w:t>
             </w:r>
           </w:p>
         </w:tc>
@@ -14333,15 +14226,8 @@
             <w:vAlign w:val="top"/>
           </w:tcPr>
           <w:p>
-            <w:pPr>
-              <w:pStyle w:val="54"/>
-              <w:bidi w:val="0"/>
-              <w:rPr>
-                <w:rFonts w:hint="default"/>
-              </w:rPr>
-            </w:pPr>
-            <w:r>
-              <w:t>95.1642%</w:t>
+            <w:r>
+              <w:t>97.0566%</w:t>
             </w:r>
           </w:p>
         </w:tc>
@@ -17436,7 +17322,7 @@
           <w:rFonts w:hint="default" w:ascii="Times New Roman" w:hAnsi="Times New Roman" w:cs="Times New Roman"/>
           <w:lang w:val="en-US" w:eastAsia="zh-CN"/>
         </w:rPr>
-        <w:t>分设施结果显示，8 个冶金设施的独立测试等级准确率均接近或高于综合模型水平。美铝电解设施的 Dk 数值范围较集中，其等级判断稳定；冶金钢铁厂虽然 MAE 相对较高，但测试工况的等级判断保持一致。大型冶金等效设施有 1 条等级误判，整体准确率为 97.8261%。</w:t>
+        <w:t>分设施结果显示，8 个冶金设施的独立测试等级准确率均高于 95%。美铝电解设施的 Dk 数值范围较集中，其等级判断稳定；冶金钢铁厂虽然 MAE 相对较高，但测试工况的等级判断保持一致。大型冶金等效设施有 2 条等级误判，整体准确率为 96.4286%。</w:t>
       </w:r>
     </w:p>
     <w:p>
@@ -17533,17 +17419,11 @@
         <w:rPr>
           <w:rFonts w:hint="default" w:ascii="Times New Roman" w:hAnsi="Times New Roman" w:cs="Times New Roman"/>
         </w:rPr>
-        <w:t>预测结果界面以设施名称和本次热源工况为基础信息，突出显示设施整体毁伤等级，同时给出连续 Dk、模型综合验证准确率和计算耗时。热源参数区分别显示方位角、俯仰角、目标热通量和持续时间，使预测结果能够与具体工况对应。对于需要进一步分析的工况，可根据预测等级和 Dk 与阈值的距离，选择相应 FDS 方案开展精细计算。</w:t>
-      </w:r>
-      <w:r>
-        <w:t>实测 36 个设施参考工况的平均单次预测耗时为 0.188 秒，统计口径包含模型加载、特征计算与推理。</w:t>
-      </w:r>
-      <w:r>
-        <w:t>实测 36 个设施参考工况的平均单次预测耗时为 0.188 秒，统计口径包含模型加载、特征计算与推理。</w:t>
-      </w:r>
-      <w:r>
-        <w:t>实测 36 个设施参考工况的平均单次预测耗时为 0.188 秒，统计口径包含模型加载、特征计算与推理。</w:t>
-      </w:r>
+        <w:t>预测结果界面以设施名称和本次热源工况为基础信息，突出显示设施整体毁伤等级，同时显示本次模型加载和推理耗时。热源参数区分别显示方位角、俯仰角、目标热通量和持续时间。程序在预测过程中显示加载状态；首次模型加载通常为数秒，后续预测受缓存影响会明显加快。</w:t>
+      </w:r>
+      <w:r/>
+      <w:r/>
+      <w:r/>
     </w:p>
     <w:p>
       <w:pPr>

</xml_diff>